<commit_message>
Read the Genius CSV exports as well as the PDFs
Same two reports, saved as CSV: every line repeats the report header and
carries its data at the end, so the columns are found by label rather than by
position. The summary is one line per working - which is where the changing
Position comes from - and the detail one line per leg, with both the arrival
and the departure at the leg's origin, so it is richer than the PDF text.

build() now takes report PDFs, CSV exports, or one of each, and merges them
into the same pair before the rulebook runs. That last part is not a
curiosity: a PDF summary that will not upload can be paired with the CSV
detail. Only Genius-with-Integrale is refused.

Verified on the real 12/08 exports through the drop zone - a 6.4 MB detail
file builds in about a second - and pinned by a test that builds the same
books from the PDF fixture and its CSV equivalent, plus the mixed pair.
</commit_message>
<xml_diff>
--- a/HOW TO USE.docx
+++ b/HOW TO USE.docx
@@ -1017,7 +1017,7 @@
           <w:sz w:val="20"/>
           <w:szCs w:val="20"/>
         </w:rPr>
-        <w:t xml:space="preserve">From Genius — two PDFs</w:t>
+        <w:t xml:space="preserve">From Genius — two reports, PDF or CSV</w:t>
       </w:r>
     </w:p>
     <w:p>
@@ -1115,6 +1115,26 @@
           <w:sz w:val="21"/>
           <w:szCs w:val="21"/>
         </w:rPr>
+        <w:t xml:space="preserve"> or a </w:t>
+      </w:r>
+      <w:r>
+        <w:rPr>
+          <w:rFonts w:ascii="Calibri" w:cs="Calibri" w:eastAsia="Calibri" w:hAnsi="Calibri"/>
+          <w:b/>
+          <w:bCs/>
+          <w:color w:val="262E33"/>
+          <w:sz w:val="21"/>
+          <w:szCs w:val="21"/>
+        </w:rPr>
+        <w:t xml:space="preserve">CSV</w:t>
+      </w:r>
+      <w:r>
+        <w:rPr>
+          <w:rFonts w:ascii="Calibri" w:cs="Calibri" w:eastAsia="Calibri" w:hAnsi="Calibri"/>
+          <w:color w:val="262E33"/>
+          <w:sz w:val="21"/>
+          <w:szCs w:val="21"/>
+        </w:rPr>
         <w:t xml:space="preserve">.</w:t>
       </w:r>
     </w:p>
@@ -1154,7 +1174,7 @@
           <w:sz w:val="21"/>
           <w:szCs w:val="21"/>
         </w:rPr>
-        <w:t xml:space="preserve"> and save that as a PDF as well.</w:t>
+        <w:t xml:space="preserve"> and save that the same way.</w:t>
       </w:r>
     </w:p>
     <w:p>
@@ -1168,7 +1188,7 @@
           <w:sz w:val="21"/>
           <w:szCs w:val="21"/>
         </w:rPr>
-        <w:t xml:space="preserve">Save both from Genius itself — a scan or a photo of a printout cannot be read.</w:t>
+        <w:t xml:space="preserve">Either format is read, and you can mix them — a PDF summary with a CSV detail builds fine. Save both from Genius itself; a scan or a photo of a printout cannot be read.</w:t>
       </w:r>
     </w:p>
     <w:p>

</xml_diff>

<commit_message>
Fix the Word guide's line spacing, and say how to check it
With LibreOffice working I could finally render the .docx, and the title was
overlapping itself: the document default set w:line without w:lineRule, which
is applied as a fixed 13.8pt leading, so a 28pt heading collided with its own
second line. Every spacing now says lineRule AUTO, and the "Monday to Friday"
line picks up the Genius CSV wording the rest of the guide already had.

The generator's header carries the recipe for rendering it: a bare
libreoffice-core cannot open any document at all, Writer has to be installed,
and Carlito gives Calibri's metrics so the line breaks land where Word puts
them.
</commit_message>
<xml_diff>
--- a/HOW TO USE.docx
+++ b/HOW TO USE.docx
@@ -35,7 +35,7 @@
     </w:p>
     <w:p>
       <w:pPr>
-        <w:spacing w:after="140" w:line="276"/>
+        <w:spacing w:after="140" w:line="276" w:lineRule="auto"/>
       </w:pPr>
       <w:r>
         <w:rPr>
@@ -98,7 +98,7 @@
           </w:p>
           <w:p>
             <w:pPr>
-              <w:spacing w:line="276"/>
+              <w:spacing w:line="276" w:lineRule="auto"/>
             </w:pPr>
             <w:r>
               <w:rPr>
@@ -155,7 +155,7 @@
     </w:p>
     <w:p>
       <w:pPr>
-        <w:spacing w:after="140" w:line="276"/>
+        <w:spacing w:after="140" w:line="276" w:lineRule="auto"/>
       </w:pPr>
       <w:r>
         <w:rPr>
@@ -183,7 +183,7 @@
           <w:ilvl w:val="0"/>
           <w:numId w:val="2"/>
         </w:numPr>
-        <w:spacing w:after="110" w:line="276"/>
+        <w:spacing w:after="110" w:line="276" w:lineRule="auto"/>
       </w:pPr>
       <w:r>
         <w:rPr>
@@ -243,7 +243,7 @@
           <w:sz w:val="21"/>
           <w:szCs w:val="21"/>
         </w:rPr>
-        <w:t xml:space="preserve"> reports for the date, as Genius PDFs or as Integrale CSV exports.</w:t>
+        <w:t xml:space="preserve"> reports for the date: from Genius as PDFs or CSVs, or from Integrale as its two CSVs.</w:t>
       </w:r>
     </w:p>
     <w:p>
@@ -253,7 +253,7 @@
           <w:ilvl w:val="0"/>
           <w:numId w:val="2"/>
         </w:numPr>
-        <w:spacing w:after="110" w:line="276"/>
+        <w:spacing w:after="110" w:line="276" w:lineRule="auto"/>
       </w:pPr>
       <w:r>
         <w:rPr>
@@ -298,7 +298,7 @@
     </w:p>
     <w:p>
       <w:pPr>
-        <w:spacing w:after="140" w:line="276"/>
+        <w:spacing w:after="140" w:line="276" w:lineRule="auto"/>
       </w:pPr>
       <w:r>
         <w:rPr>
@@ -337,7 +337,7 @@
           <w:ilvl w:val="0"/>
           <w:numId w:val="3"/>
         </w:numPr>
-        <w:spacing w:after="110" w:line="276"/>
+        <w:spacing w:after="110" w:line="276" w:lineRule="auto"/>
       </w:pPr>
       <w:r>
         <w:rPr>
@@ -376,7 +376,7 @@
           <w:ilvl w:val="0"/>
           <w:numId w:val="3"/>
         </w:numPr>
-        <w:spacing w:after="110" w:line="276"/>
+        <w:spacing w:after="110" w:line="276" w:lineRule="auto"/>
       </w:pPr>
       <w:r>
         <w:rPr>
@@ -435,7 +435,7 @@
           <w:ilvl w:val="0"/>
           <w:numId w:val="3"/>
         </w:numPr>
-        <w:spacing w:after="110" w:line="276"/>
+        <w:spacing w:after="110" w:line="276" w:lineRule="auto"/>
       </w:pPr>
       <w:r>
         <w:rPr>
@@ -494,7 +494,7 @@
           <w:ilvl w:val="0"/>
           <w:numId w:val="3"/>
         </w:numPr>
-        <w:spacing w:after="110" w:line="276"/>
+        <w:spacing w:after="110" w:line="276" w:lineRule="auto"/>
       </w:pPr>
       <w:r>
         <w:rPr>
@@ -548,7 +548,7 @@
     </w:p>
     <w:p>
       <w:pPr>
-        <w:spacing w:after="140" w:line="276"/>
+        <w:spacing w:after="140" w:line="276" w:lineRule="auto"/>
       </w:pPr>
       <w:r>
         <w:rPr>
@@ -582,7 +582,7 @@
     </w:p>
     <w:p>
       <w:pPr>
-        <w:spacing w:after="140" w:line="276"/>
+        <w:spacing w:after="140" w:line="276" w:lineRule="auto"/>
       </w:pPr>
       <w:r>
         <w:rPr>
@@ -601,7 +601,7 @@
           <w:ilvl w:val="0"/>
           <w:numId w:val="4"/>
         </w:numPr>
-        <w:spacing w:after="110" w:line="276"/>
+        <w:spacing w:after="110" w:line="276" w:lineRule="auto"/>
       </w:pPr>
       <w:r>
         <w:rPr>
@@ -660,7 +660,7 @@
           <w:ilvl w:val="0"/>
           <w:numId w:val="4"/>
         </w:numPr>
-        <w:spacing w:after="110" w:line="276"/>
+        <w:spacing w:after="110" w:line="276" w:lineRule="auto"/>
       </w:pPr>
       <w:r>
         <w:rPr>
@@ -679,7 +679,7 @@
           <w:ilvl w:val="0"/>
           <w:numId w:val="4"/>
         </w:numPr>
-        <w:spacing w:after="110" w:line="276"/>
+        <w:spacing w:after="110" w:line="276" w:lineRule="auto"/>
       </w:pPr>
       <w:r>
         <w:rPr>
@@ -693,7 +693,7 @@
     </w:p>
     <w:p>
       <w:pPr>
-        <w:spacing w:after="140" w:line="276"/>
+        <w:spacing w:after="140" w:line="276" w:lineRule="auto"/>
       </w:pPr>
       <w:r>
         <w:rPr>
@@ -739,7 +739,7 @@
           </w:tcPr>
           <w:p>
             <w:pPr>
-              <w:spacing w:line="264"/>
+              <w:spacing w:line="264" w:lineRule="auto"/>
             </w:pPr>
             <w:r>
               <w:rPr>
@@ -766,7 +766,7 @@
           </w:tcPr>
           <w:p>
             <w:pPr>
-              <w:spacing w:line="264"/>
+              <w:spacing w:line="264" w:lineRule="auto"/>
             </w:pPr>
             <w:r>
               <w:rPr>
@@ -793,7 +793,7 @@
           </w:tcPr>
           <w:p>
             <w:pPr>
-              <w:spacing w:line="264"/>
+              <w:spacing w:line="264" w:lineRule="auto"/>
             </w:pPr>
             <w:r>
               <w:rPr>
@@ -821,7 +821,7 @@
           </w:tcPr>
           <w:p>
             <w:pPr>
-              <w:spacing w:line="264"/>
+              <w:spacing w:line="264" w:lineRule="auto"/>
             </w:pPr>
             <w:r>
               <w:rPr>
@@ -846,7 +846,7 @@
           </w:tcPr>
           <w:p>
             <w:pPr>
-              <w:spacing w:line="264"/>
+              <w:spacing w:line="264" w:lineRule="auto"/>
             </w:pPr>
             <w:r>
               <w:rPr>
@@ -871,7 +871,7 @@
           </w:tcPr>
           <w:p>
             <w:pPr>
-              <w:spacing w:line="264"/>
+              <w:spacing w:line="264" w:lineRule="auto"/>
             </w:pPr>
             <w:r>
               <w:rPr>
@@ -898,7 +898,7 @@
           </w:tcPr>
           <w:p>
             <w:pPr>
-              <w:spacing w:line="264"/>
+              <w:spacing w:line="264" w:lineRule="auto"/>
             </w:pPr>
             <w:r>
               <w:rPr>
@@ -923,7 +923,7 @@
           </w:tcPr>
           <w:p>
             <w:pPr>
-              <w:spacing w:line="264"/>
+              <w:spacing w:line="264" w:lineRule="auto"/>
             </w:pPr>
             <w:r>
               <w:rPr>
@@ -948,7 +948,7 @@
           </w:tcPr>
           <w:p>
             <w:pPr>
-              <w:spacing w:line="264"/>
+              <w:spacing w:line="264" w:lineRule="auto"/>
             </w:pPr>
             <w:r>
               <w:rPr>
@@ -970,7 +970,7 @@
     </w:p>
     <w:p>
       <w:pPr>
-        <w:spacing w:after="140" w:line="276"/>
+        <w:spacing w:after="140" w:line="276" w:lineRule="auto"/>
       </w:pPr>
       <w:r>
         <w:rPr>
@@ -1027,7 +1027,7 @@
           <w:ilvl w:val="0"/>
           <w:numId w:val="5"/>
         </w:numPr>
-        <w:spacing w:after="110" w:line="276"/>
+        <w:spacing w:after="110" w:line="276" w:lineRule="auto"/>
       </w:pPr>
       <w:r>
         <w:rPr>
@@ -1066,7 +1066,7 @@
           <w:ilvl w:val="0"/>
           <w:numId w:val="5"/>
         </w:numPr>
-        <w:spacing w:after="110" w:line="276"/>
+        <w:spacing w:after="110" w:line="276" w:lineRule="auto"/>
       </w:pPr>
       <w:r>
         <w:rPr>
@@ -1145,7 +1145,7 @@
           <w:ilvl w:val="0"/>
           <w:numId w:val="5"/>
         </w:numPr>
-        <w:spacing w:after="110" w:line="276"/>
+        <w:spacing w:after="110" w:line="276" w:lineRule="auto"/>
       </w:pPr>
       <w:r>
         <w:rPr>
@@ -1179,7 +1179,7 @@
     </w:p>
     <w:p>
       <w:pPr>
-        <w:spacing w:after="140" w:line="276"/>
+        <w:spacing w:after="140" w:line="276" w:lineRule="auto"/>
       </w:pPr>
       <w:r>
         <w:rPr>
@@ -1211,7 +1211,7 @@
     </w:p>
     <w:p>
       <w:pPr>
-        <w:spacing w:after="140" w:line="276"/>
+        <w:spacing w:after="140" w:line="276" w:lineRule="auto"/>
       </w:pPr>
       <w:r>
         <w:rPr>
@@ -1232,7 +1232,7 @@
           <w:ilvl w:val="0"/>
           <w:numId w:val="6"/>
         </w:numPr>
-        <w:spacing w:after="110" w:line="276"/>
+        <w:spacing w:after="110" w:line="276" w:lineRule="auto"/>
       </w:pPr>
       <w:r>
         <w:rPr>
@@ -1291,7 +1291,7 @@
           <w:ilvl w:val="0"/>
           <w:numId w:val="6"/>
         </w:numPr>
-        <w:spacing w:after="110" w:line="276"/>
+        <w:spacing w:after="110" w:line="276" w:lineRule="auto"/>
       </w:pPr>
       <w:r>
         <w:rPr>
@@ -1330,7 +1330,7 @@
           <w:ilvl w:val="0"/>
           <w:numId w:val="6"/>
         </w:numPr>
-        <w:spacing w:after="110" w:line="276"/>
+        <w:spacing w:after="110" w:line="276" w:lineRule="auto"/>
       </w:pPr>
       <w:r>
         <w:rPr>
@@ -1404,7 +1404,7 @@
     </w:p>
     <w:p>
       <w:pPr>
-        <w:spacing w:after="140" w:line="276"/>
+        <w:spacing w:after="140" w:line="276" w:lineRule="auto"/>
       </w:pPr>
       <w:r>
         <w:rPr>
@@ -1425,7 +1425,7 @@
           <w:ilvl w:val="0"/>
           <w:numId w:val="7"/>
         </w:numPr>
-        <w:spacing w:after="110" w:line="276"/>
+        <w:spacing w:after="110" w:line="276" w:lineRule="auto"/>
       </w:pPr>
       <w:r>
         <w:rPr>
@@ -1484,7 +1484,7 @@
           <w:ilvl w:val="0"/>
           <w:numId w:val="7"/>
         </w:numPr>
-        <w:spacing w:after="110" w:line="276"/>
+        <w:spacing w:after="110" w:line="276" w:lineRule="auto"/>
       </w:pPr>
       <w:r>
         <w:rPr>
@@ -1523,7 +1523,7 @@
           <w:ilvl w:val="0"/>
           <w:numId w:val="7"/>
         </w:numPr>
-        <w:spacing w:after="110" w:line="276"/>
+        <w:spacing w:after="110" w:line="276" w:lineRule="auto"/>
       </w:pPr>
       <w:r>
         <w:rPr>
@@ -1582,7 +1582,7 @@
           <w:ilvl w:val="0"/>
           <w:numId w:val="7"/>
         </w:numPr>
-        <w:spacing w:after="110" w:line="276"/>
+        <w:spacing w:after="110" w:line="276" w:lineRule="auto"/>
       </w:pPr>
       <w:r>
         <w:rPr>
@@ -1641,7 +1641,7 @@
           <w:ilvl w:val="0"/>
           <w:numId w:val="7"/>
         </w:numPr>
-        <w:spacing w:after="110" w:line="276"/>
+        <w:spacing w:after="110" w:line="276" w:lineRule="auto"/>
       </w:pPr>
       <w:r>
         <w:rPr>
@@ -1675,7 +1675,7 @@
     </w:p>
     <w:p>
       <w:pPr>
-        <w:spacing w:after="140" w:line="276"/>
+        <w:spacing w:after="140" w:line="276" w:lineRule="auto"/>
       </w:pPr>
       <w:r>
         <w:rPr>
@@ -1778,7 +1778,7 @@
           </w:p>
           <w:p>
             <w:pPr>
-              <w:spacing w:line="276"/>
+              <w:spacing w:line="276" w:lineRule="auto"/>
             </w:pPr>
             <w:r>
               <w:rPr>
@@ -1818,7 +1818,7 @@
     </w:p>
     <w:p>
       <w:pPr>
-        <w:spacing w:after="140" w:line="276"/>
+        <w:spacing w:after="140" w:line="276" w:lineRule="auto"/>
       </w:pPr>
       <w:r>
         <w:rPr>
@@ -1952,7 +1952,7 @@
           <w:ilvl w:val="0"/>
           <w:numId w:val="8"/>
         </w:numPr>
-        <w:spacing w:after="110" w:line="276"/>
+        <w:spacing w:after="110" w:line="276" w:lineRule="auto"/>
       </w:pPr>
       <w:r>
         <w:rPr>
@@ -1982,7 +1982,7 @@
           <w:ilvl w:val="0"/>
           <w:numId w:val="8"/>
         </w:numPr>
-        <w:spacing w:after="110" w:line="276"/>
+        <w:spacing w:after="110" w:line="276" w:lineRule="auto"/>
       </w:pPr>
       <w:r>
         <w:rPr>
@@ -2012,7 +2012,7 @@
           <w:ilvl w:val="0"/>
           <w:numId w:val="8"/>
         </w:numPr>
-        <w:spacing w:after="110" w:line="276"/>
+        <w:spacing w:after="110" w:line="276" w:lineRule="auto"/>
       </w:pPr>
       <w:r>
         <w:rPr>
@@ -2042,7 +2042,7 @@
           <w:ilvl w:val="0"/>
           <w:numId w:val="8"/>
         </w:numPr>
-        <w:spacing w:after="110" w:line="276"/>
+        <w:spacing w:after="110" w:line="276" w:lineRule="auto"/>
       </w:pPr>
       <w:r>
         <w:rPr>
@@ -2112,7 +2112,7 @@
           <w:ilvl w:val="0"/>
           <w:numId w:val="8"/>
         </w:numPr>
-        <w:spacing w:after="110" w:line="276"/>
+        <w:spacing w:after="110" w:line="276" w:lineRule="auto"/>
       </w:pPr>
       <w:r>
         <w:rPr>
@@ -2226,7 +2226,7 @@
           </w:p>
           <w:p>
             <w:pPr>
-              <w:spacing w:line="276"/>
+              <w:spacing w:line="276" w:lineRule="auto"/>
             </w:pPr>
             <w:r>
               <w:rPr>
@@ -2248,7 +2248,7 @@
     </w:p>
     <w:p>
       <w:pPr>
-        <w:spacing w:after="140" w:line="276"/>
+        <w:spacing w:after="140" w:line="276" w:lineRule="auto"/>
       </w:pPr>
       <w:r>
         <w:rPr>
@@ -2322,7 +2322,7 @@
           <w:ilvl w:val="0"/>
           <w:numId w:val="9"/>
         </w:numPr>
-        <w:spacing w:after="110" w:line="276"/>
+        <w:spacing w:after="110" w:line="276" w:lineRule="auto"/>
       </w:pPr>
       <w:r>
         <w:rPr>
@@ -2352,7 +2352,7 @@
           <w:ilvl w:val="0"/>
           <w:numId w:val="9"/>
         </w:numPr>
-        <w:spacing w:after="110" w:line="276"/>
+        <w:spacing w:after="110" w:line="276" w:lineRule="auto"/>
       </w:pPr>
       <w:r>
         <w:rPr>
@@ -2382,7 +2382,7 @@
           <w:ilvl w:val="0"/>
           <w:numId w:val="9"/>
         </w:numPr>
-        <w:spacing w:after="110" w:line="276"/>
+        <w:spacing w:after="110" w:line="276" w:lineRule="auto"/>
       </w:pPr>
       <w:r>
         <w:rPr>
@@ -2412,7 +2412,7 @@
           <w:ilvl w:val="0"/>
           <w:numId w:val="9"/>
         </w:numPr>
-        <w:spacing w:after="110" w:line="276"/>
+        <w:spacing w:after="110" w:line="276" w:lineRule="auto"/>
       </w:pPr>
       <w:r>
         <w:rPr>
@@ -2451,7 +2451,7 @@
           <w:ilvl w:val="0"/>
           <w:numId w:val="9"/>
         </w:numPr>
-        <w:spacing w:after="110" w:line="276"/>
+        <w:spacing w:after="110" w:line="276" w:lineRule="auto"/>
       </w:pPr>
       <w:r>
         <w:rPr>
@@ -2476,7 +2476,7 @@
     </w:p>
     <w:p>
       <w:pPr>
-        <w:spacing w:after="140" w:line="276"/>
+        <w:spacing w:after="140" w:line="276" w:lineRule="auto"/>
       </w:pPr>
       <w:r>
         <w:rPr>
@@ -2560,7 +2560,7 @@
           </w:tcPr>
           <w:p>
             <w:pPr>
-              <w:spacing w:line="264"/>
+              <w:spacing w:line="264" w:lineRule="auto"/>
             </w:pPr>
             <w:r>
               <w:rPr>
@@ -2587,7 +2587,7 @@
           </w:tcPr>
           <w:p>
             <w:pPr>
-              <w:spacing w:line="264"/>
+              <w:spacing w:line="264" w:lineRule="auto"/>
             </w:pPr>
             <w:r>
               <w:rPr>
@@ -2614,7 +2614,7 @@
           </w:tcPr>
           <w:p>
             <w:pPr>
-              <w:spacing w:line="264"/>
+              <w:spacing w:line="264" w:lineRule="auto"/>
             </w:pPr>
             <w:r>
               <w:rPr>
@@ -2642,7 +2642,7 @@
           </w:tcPr>
           <w:p>
             <w:pPr>
-              <w:spacing w:line="264"/>
+              <w:spacing w:line="264" w:lineRule="auto"/>
             </w:pPr>
             <w:r>
               <w:rPr>
@@ -2667,7 +2667,7 @@
           </w:tcPr>
           <w:p>
             <w:pPr>
-              <w:spacing w:line="264"/>
+              <w:spacing w:line="264" w:lineRule="auto"/>
             </w:pPr>
             <w:r>
               <w:rPr>
@@ -2692,7 +2692,7 @@
           </w:tcPr>
           <w:p>
             <w:pPr>
-              <w:spacing w:line="264"/>
+              <w:spacing w:line="264" w:lineRule="auto"/>
             </w:pPr>
             <w:r>
               <w:rPr>
@@ -2719,7 +2719,7 @@
           </w:tcPr>
           <w:p>
             <w:pPr>
-              <w:spacing w:line="264"/>
+              <w:spacing w:line="264" w:lineRule="auto"/>
             </w:pPr>
             <w:r>
               <w:rPr>
@@ -2744,7 +2744,7 @@
           </w:tcPr>
           <w:p>
             <w:pPr>
-              <w:spacing w:line="264"/>
+              <w:spacing w:line="264" w:lineRule="auto"/>
             </w:pPr>
             <w:r>
               <w:rPr>
@@ -2769,7 +2769,7 @@
           </w:tcPr>
           <w:p>
             <w:pPr>
-              <w:spacing w:line="264"/>
+              <w:spacing w:line="264" w:lineRule="auto"/>
             </w:pPr>
             <w:r>
               <w:rPr>
@@ -2796,7 +2796,7 @@
           </w:tcPr>
           <w:p>
             <w:pPr>
-              <w:spacing w:line="264"/>
+              <w:spacing w:line="264" w:lineRule="auto"/>
             </w:pPr>
             <w:r>
               <w:rPr>
@@ -2821,7 +2821,7 @@
           </w:tcPr>
           <w:p>
             <w:pPr>
-              <w:spacing w:line="264"/>
+              <w:spacing w:line="264" w:lineRule="auto"/>
             </w:pPr>
             <w:r>
               <w:rPr>
@@ -2846,7 +2846,7 @@
           </w:tcPr>
           <w:p>
             <w:pPr>
-              <w:spacing w:line="264"/>
+              <w:spacing w:line="264" w:lineRule="auto"/>
             </w:pPr>
             <w:r>
               <w:rPr>
@@ -2873,7 +2873,7 @@
           </w:tcPr>
           <w:p>
             <w:pPr>
-              <w:spacing w:line="264"/>
+              <w:spacing w:line="264" w:lineRule="auto"/>
             </w:pPr>
             <w:r>
               <w:rPr>
@@ -2898,7 +2898,7 @@
           </w:tcPr>
           <w:p>
             <w:pPr>
-              <w:spacing w:line="264"/>
+              <w:spacing w:line="264" w:lineRule="auto"/>
             </w:pPr>
             <w:r>
               <w:rPr>
@@ -2923,7 +2923,7 @@
           </w:tcPr>
           <w:p>
             <w:pPr>
-              <w:spacing w:line="264"/>
+              <w:spacing w:line="264" w:lineRule="auto"/>
             </w:pPr>
             <w:r>
               <w:rPr>
@@ -2963,7 +2963,7 @@
     </w:p>
     <w:p>
       <w:pPr>
-        <w:spacing w:after="140" w:line="276"/>
+        <w:spacing w:after="140" w:line="276" w:lineRule="auto"/>
       </w:pPr>
       <w:r>
         <w:rPr>
@@ -3037,7 +3037,7 @@
     </w:p>
     <w:p>
       <w:pPr>
-        <w:spacing w:after="140" w:line="276"/>
+        <w:spacing w:after="140" w:line="276" w:lineRule="auto"/>
       </w:pPr>
       <w:r>
         <w:rPr>
@@ -3107,7 +3107,7 @@
     </w:p>
     <w:p>
       <w:pPr>
-        <w:spacing w:after="140" w:line="276"/>
+        <w:spacing w:after="140" w:line="276" w:lineRule="auto"/>
       </w:pPr>
       <w:r>
         <w:rPr>
@@ -3141,7 +3141,7 @@
     </w:p>
     <w:p>
       <w:pPr>
-        <w:spacing w:after="140" w:line="276"/>
+        <w:spacing w:after="140" w:line="276" w:lineRule="auto"/>
       </w:pPr>
       <w:r>
         <w:rPr>
@@ -3547,7 +3547,7 @@
           </w:tcPr>
           <w:p>
             <w:pPr>
-              <w:spacing w:line="264"/>
+              <w:spacing w:line="264" w:lineRule="auto"/>
             </w:pPr>
             <w:r>
               <w:rPr>
@@ -3574,7 +3574,7 @@
           </w:tcPr>
           <w:p>
             <w:pPr>
-              <w:spacing w:line="264"/>
+              <w:spacing w:line="264" w:lineRule="auto"/>
             </w:pPr>
             <w:r>
               <w:rPr>
@@ -3601,7 +3601,7 @@
           </w:tcPr>
           <w:p>
             <w:pPr>
-              <w:spacing w:line="264"/>
+              <w:spacing w:line="264" w:lineRule="auto"/>
             </w:pPr>
             <w:r>
               <w:rPr>
@@ -3629,7 +3629,7 @@
           </w:tcPr>
           <w:p>
             <w:pPr>
-              <w:spacing w:line="264"/>
+              <w:spacing w:line="264" w:lineRule="auto"/>
             </w:pPr>
             <w:r>
               <w:rPr>
@@ -3654,7 +3654,7 @@
           </w:tcPr>
           <w:p>
             <w:pPr>
-              <w:spacing w:line="264"/>
+              <w:spacing w:line="264" w:lineRule="auto"/>
             </w:pPr>
             <w:r>
               <w:rPr>
@@ -3679,7 +3679,7 @@
           </w:tcPr>
           <w:p>
             <w:pPr>
-              <w:spacing w:line="264"/>
+              <w:spacing w:line="264" w:lineRule="auto"/>
             </w:pPr>
             <w:r>
               <w:rPr>
@@ -3706,7 +3706,7 @@
           </w:tcPr>
           <w:p>
             <w:pPr>
-              <w:spacing w:line="264"/>
+              <w:spacing w:line="264" w:lineRule="auto"/>
             </w:pPr>
             <w:r>
               <w:rPr>
@@ -3731,7 +3731,7 @@
           </w:tcPr>
           <w:p>
             <w:pPr>
-              <w:spacing w:line="264"/>
+              <w:spacing w:line="264" w:lineRule="auto"/>
             </w:pPr>
             <w:r>
               <w:rPr>
@@ -3756,7 +3756,7 @@
           </w:tcPr>
           <w:p>
             <w:pPr>
-              <w:spacing w:line="264"/>
+              <w:spacing w:line="264" w:lineRule="auto"/>
             </w:pPr>
             <w:r>
               <w:rPr>
@@ -3783,7 +3783,7 @@
           </w:tcPr>
           <w:p>
             <w:pPr>
-              <w:spacing w:line="264"/>
+              <w:spacing w:line="264" w:lineRule="auto"/>
             </w:pPr>
             <w:r>
               <w:rPr>
@@ -3808,7 +3808,7 @@
           </w:tcPr>
           <w:p>
             <w:pPr>
-              <w:spacing w:line="264"/>
+              <w:spacing w:line="264" w:lineRule="auto"/>
             </w:pPr>
             <w:r>
               <w:rPr>
@@ -3833,7 +3833,7 @@
           </w:tcPr>
           <w:p>
             <w:pPr>
-              <w:spacing w:line="264"/>
+              <w:spacing w:line="264" w:lineRule="auto"/>
             </w:pPr>
             <w:r>
               <w:rPr>
@@ -3860,7 +3860,7 @@
           </w:tcPr>
           <w:p>
             <w:pPr>
-              <w:spacing w:line="264"/>
+              <w:spacing w:line="264" w:lineRule="auto"/>
             </w:pPr>
             <w:r>
               <w:rPr>
@@ -3885,7 +3885,7 @@
           </w:tcPr>
           <w:p>
             <w:pPr>
-              <w:spacing w:line="264"/>
+              <w:spacing w:line="264" w:lineRule="auto"/>
             </w:pPr>
             <w:r>
               <w:rPr>
@@ -3921,7 +3921,7 @@
           </w:tcPr>
           <w:p>
             <w:pPr>
-              <w:spacing w:line="264"/>
+              <w:spacing w:line="264" w:lineRule="auto"/>
             </w:pPr>
             <w:r>
               <w:rPr>
@@ -3948,7 +3948,7 @@
           </w:tcPr>
           <w:p>
             <w:pPr>
-              <w:spacing w:line="264"/>
+              <w:spacing w:line="264" w:lineRule="auto"/>
             </w:pPr>
             <w:r>
               <w:rPr>
@@ -3973,7 +3973,7 @@
           </w:tcPr>
           <w:p>
             <w:pPr>
-              <w:spacing w:line="264"/>
+              <w:spacing w:line="264" w:lineRule="auto"/>
             </w:pPr>
             <w:r>
               <w:rPr>
@@ -4009,7 +4009,7 @@
           </w:tcPr>
           <w:p>
             <w:pPr>
-              <w:spacing w:line="264"/>
+              <w:spacing w:line="264" w:lineRule="auto"/>
             </w:pPr>
             <w:r>
               <w:rPr>
@@ -4036,7 +4036,7 @@
           </w:tcPr>
           <w:p>
             <w:pPr>
-              <w:spacing w:line="264"/>
+              <w:spacing w:line="264" w:lineRule="auto"/>
             </w:pPr>
             <w:r>
               <w:rPr>
@@ -4061,7 +4061,7 @@
           </w:tcPr>
           <w:p>
             <w:pPr>
-              <w:spacing w:line="264"/>
+              <w:spacing w:line="264" w:lineRule="auto"/>
             </w:pPr>
             <w:r>
               <w:rPr>
@@ -4086,7 +4086,7 @@
           </w:tcPr>
           <w:p>
             <w:pPr>
-              <w:spacing w:line="264"/>
+              <w:spacing w:line="264" w:lineRule="auto"/>
             </w:pPr>
             <w:r>
               <w:rPr>
@@ -4113,7 +4113,7 @@
           </w:tcPr>
           <w:p>
             <w:pPr>
-              <w:spacing w:line="264"/>
+              <w:spacing w:line="264" w:lineRule="auto"/>
             </w:pPr>
             <w:r>
               <w:rPr>
@@ -4138,7 +4138,7 @@
           </w:tcPr>
           <w:p>
             <w:pPr>
-              <w:spacing w:line="264"/>
+              <w:spacing w:line="264" w:lineRule="auto"/>
             </w:pPr>
             <w:r>
               <w:rPr>
@@ -4163,7 +4163,7 @@
           </w:tcPr>
           <w:p>
             <w:pPr>
-              <w:spacing w:line="264"/>
+              <w:spacing w:line="264" w:lineRule="auto"/>
             </w:pPr>
             <w:r>
               <w:rPr>
@@ -4185,7 +4185,7 @@
     </w:p>
     <w:p>
       <w:pPr>
-        <w:spacing w:after="140" w:line="276"/>
+        <w:spacing w:after="140" w:line="276" w:lineRule="auto"/>
       </w:pPr>
       <w:r>
         <w:rPr>
@@ -4266,7 +4266,7 @@
     </w:p>
     <w:p>
       <w:pPr>
-        <w:spacing w:after="140" w:line="276"/>
+        <w:spacing w:after="140" w:line="276" w:lineRule="auto"/>
       </w:pPr>
       <w:r>
         <w:rPr>
@@ -4311,7 +4311,7 @@
     </w:p>
     <w:p>
       <w:pPr>
-        <w:spacing w:after="140" w:line="276"/>
+        <w:spacing w:after="140" w:line="276" w:lineRule="auto"/>
       </w:pPr>
       <w:r>
         <w:rPr>
@@ -4493,7 +4493,7 @@
           </w:p>
           <w:p>
             <w:pPr>
-              <w:spacing w:line="276"/>
+              <w:spacing w:line="276" w:lineRule="auto"/>
             </w:pPr>
             <w:r>
               <w:rPr>
@@ -4533,7 +4533,7 @@
     </w:p>
     <w:p>
       <w:pPr>
-        <w:spacing w:after="140" w:line="276"/>
+        <w:spacing w:after="140" w:line="276" w:lineRule="auto"/>
       </w:pPr>
       <w:r>
         <w:rPr>
@@ -4625,7 +4625,7 @@
     </w:p>
     <w:p>
       <w:pPr>
-        <w:spacing w:after="140" w:line="276"/>
+        <w:spacing w:after="140" w:line="276" w:lineRule="auto"/>
       </w:pPr>
       <w:r>
         <w:rPr>
@@ -4659,7 +4659,7 @@
     </w:p>
     <w:p>
       <w:pPr>
-        <w:spacing w:after="140" w:line="276"/>
+        <w:spacing w:after="140" w:line="276" w:lineRule="auto"/>
       </w:pPr>
       <w:r>
         <w:rPr>
@@ -4736,7 +4736,7 @@
           <w:ilvl w:val="0"/>
           <w:numId w:val="10"/>
         </w:numPr>
-        <w:spacing w:after="110" w:line="276"/>
+        <w:spacing w:after="110" w:line="276" w:lineRule="auto"/>
       </w:pPr>
       <w:r>
         <w:rPr>
@@ -4766,7 +4766,7 @@
           <w:ilvl w:val="0"/>
           <w:numId w:val="10"/>
         </w:numPr>
-        <w:spacing w:after="110" w:line="276"/>
+        <w:spacing w:after="110" w:line="276" w:lineRule="auto"/>
       </w:pPr>
       <w:r>
         <w:rPr>
@@ -4796,7 +4796,7 @@
           <w:ilvl w:val="0"/>
           <w:numId w:val="10"/>
         </w:numPr>
-        <w:spacing w:after="110" w:line="276"/>
+        <w:spacing w:after="110" w:line="276" w:lineRule="auto"/>
       </w:pPr>
       <w:r>
         <w:rPr>
@@ -4826,7 +4826,7 @@
           <w:ilvl w:val="0"/>
           <w:numId w:val="10"/>
         </w:numPr>
-        <w:spacing w:after="110" w:line="276"/>
+        <w:spacing w:after="110" w:line="276" w:lineRule="auto"/>
       </w:pPr>
       <w:r>
         <w:rPr>
@@ -4856,7 +4856,7 @@
           <w:ilvl w:val="0"/>
           <w:numId w:val="10"/>
         </w:numPr>
-        <w:spacing w:after="110" w:line="276"/>
+        <w:spacing w:after="110" w:line="276" w:lineRule="auto"/>
       </w:pPr>
       <w:r>
         <w:rPr>
@@ -4881,7 +4881,7 @@
     </w:p>
     <w:p>
       <w:pPr>
-        <w:spacing w:after="140" w:line="276"/>
+        <w:spacing w:after="140" w:line="276" w:lineRule="auto"/>
       </w:pPr>
       <w:r>
         <w:rPr>
@@ -4915,7 +4915,7 @@
     </w:p>
     <w:p>
       <w:pPr>
-        <w:spacing w:after="140" w:line="276"/>
+        <w:spacing w:after="140" w:line="276" w:lineRule="auto"/>
       </w:pPr>
       <w:r>
         <w:rPr>
@@ -5014,7 +5014,7 @@
           <w:ilvl w:val="0"/>
           <w:numId w:val="11"/>
         </w:numPr>
-        <w:spacing w:after="110" w:line="276"/>
+        <w:spacing w:after="110" w:line="276" w:lineRule="auto"/>
       </w:pPr>
       <w:r>
         <w:rPr>
@@ -5044,7 +5044,7 @@
           <w:ilvl w:val="0"/>
           <w:numId w:val="11"/>
         </w:numPr>
-        <w:spacing w:after="110" w:line="276"/>
+        <w:spacing w:after="110" w:line="276" w:lineRule="auto"/>
       </w:pPr>
       <w:r>
         <w:rPr>
@@ -5089,7 +5089,7 @@
     </w:p>
     <w:p>
       <w:pPr>
-        <w:spacing w:after="140" w:line="276"/>
+        <w:spacing w:after="140" w:line="276" w:lineRule="auto"/>
       </w:pPr>
       <w:r>
         <w:rPr>
@@ -5152,7 +5152,7 @@
           </w:p>
           <w:p>
             <w:pPr>
-              <w:spacing w:line="276"/>
+              <w:spacing w:line="276" w:lineRule="auto"/>
             </w:pPr>
             <w:r>
               <w:rPr>
@@ -5220,7 +5220,7 @@
           </w:tcPr>
           <w:p>
             <w:pPr>
-              <w:spacing w:line="264"/>
+              <w:spacing w:line="264" w:lineRule="auto"/>
             </w:pPr>
             <w:r>
               <w:rPr>
@@ -5247,7 +5247,7 @@
           </w:tcPr>
           <w:p>
             <w:pPr>
-              <w:spacing w:line="264"/>
+              <w:spacing w:line="264" w:lineRule="auto"/>
             </w:pPr>
             <w:r>
               <w:rPr>
@@ -5275,7 +5275,7 @@
           </w:tcPr>
           <w:p>
             <w:pPr>
-              <w:spacing w:line="264"/>
+              <w:spacing w:line="264" w:lineRule="auto"/>
             </w:pPr>
             <w:r>
               <w:rPr>
@@ -5300,7 +5300,7 @@
           </w:tcPr>
           <w:p>
             <w:pPr>
-              <w:spacing w:line="264"/>
+              <w:spacing w:line="264" w:lineRule="auto"/>
             </w:pPr>
             <w:r>
               <w:rPr>
@@ -5327,7 +5327,7 @@
           </w:tcPr>
           <w:p>
             <w:pPr>
-              <w:spacing w:line="264"/>
+              <w:spacing w:line="264" w:lineRule="auto"/>
             </w:pPr>
             <w:r>
               <w:rPr>
@@ -5352,7 +5352,7 @@
           </w:tcPr>
           <w:p>
             <w:pPr>
-              <w:spacing w:line="264"/>
+              <w:spacing w:line="264" w:lineRule="auto"/>
             </w:pPr>
             <w:r>
               <w:rPr>
@@ -5379,7 +5379,7 @@
           </w:tcPr>
           <w:p>
             <w:pPr>
-              <w:spacing w:line="264"/>
+              <w:spacing w:line="264" w:lineRule="auto"/>
             </w:pPr>
             <w:r>
               <w:rPr>
@@ -5404,7 +5404,7 @@
           </w:tcPr>
           <w:p>
             <w:pPr>
-              <w:spacing w:line="264"/>
+              <w:spacing w:line="264" w:lineRule="auto"/>
             </w:pPr>
             <w:r>
               <w:rPr>
@@ -5431,7 +5431,7 @@
           </w:tcPr>
           <w:p>
             <w:pPr>
-              <w:spacing w:line="264"/>
+              <w:spacing w:line="264" w:lineRule="auto"/>
             </w:pPr>
             <w:r>
               <w:rPr>
@@ -5456,7 +5456,7 @@
           </w:tcPr>
           <w:p>
             <w:pPr>
-              <w:spacing w:line="264"/>
+              <w:spacing w:line="264" w:lineRule="auto"/>
             </w:pPr>
             <w:r>
               <w:rPr>
@@ -5483,7 +5483,7 @@
           </w:tcPr>
           <w:p>
             <w:pPr>
-              <w:spacing w:line="264"/>
+              <w:spacing w:line="264" w:lineRule="auto"/>
             </w:pPr>
             <w:r>
               <w:rPr>
@@ -5508,7 +5508,7 @@
           </w:tcPr>
           <w:p>
             <w:pPr>
-              <w:spacing w:line="264"/>
+              <w:spacing w:line="264" w:lineRule="auto"/>
             </w:pPr>
             <w:r>
               <w:rPr>
@@ -5535,7 +5535,7 @@
           </w:tcPr>
           <w:p>
             <w:pPr>
-              <w:spacing w:line="264"/>
+              <w:spacing w:line="264" w:lineRule="auto"/>
             </w:pPr>
             <w:r>
               <w:rPr>
@@ -5560,7 +5560,7 @@
           </w:tcPr>
           <w:p>
             <w:pPr>
-              <w:spacing w:line="264"/>
+              <w:spacing w:line="264" w:lineRule="auto"/>
             </w:pPr>
             <w:r>
               <w:rPr>
@@ -5587,7 +5587,7 @@
           </w:tcPr>
           <w:p>
             <w:pPr>
-              <w:spacing w:line="264"/>
+              <w:spacing w:line="264" w:lineRule="auto"/>
             </w:pPr>
             <w:r>
               <w:rPr>
@@ -5612,7 +5612,7 @@
           </w:tcPr>
           <w:p>
             <w:pPr>
-              <w:spacing w:line="264"/>
+              <w:spacing w:line="264" w:lineRule="auto"/>
             </w:pPr>
             <w:r>
               <w:rPr>
@@ -5639,7 +5639,7 @@
           </w:tcPr>
           <w:p>
             <w:pPr>
-              <w:spacing w:line="264"/>
+              <w:spacing w:line="264" w:lineRule="auto"/>
             </w:pPr>
             <w:r>
               <w:rPr>
@@ -5664,7 +5664,7 @@
           </w:tcPr>
           <w:p>
             <w:pPr>
-              <w:spacing w:line="264"/>
+              <w:spacing w:line="264" w:lineRule="auto"/>
             </w:pPr>
             <w:r>
               <w:rPr>
@@ -5691,7 +5691,7 @@
           </w:tcPr>
           <w:p>
             <w:pPr>
-              <w:spacing w:line="264"/>
+              <w:spacing w:line="264" w:lineRule="auto"/>
             </w:pPr>
             <w:r>
               <w:rPr>
@@ -5716,7 +5716,7 @@
           </w:tcPr>
           <w:p>
             <w:pPr>
-              <w:spacing w:line="264"/>
+              <w:spacing w:line="264" w:lineRule="auto"/>
             </w:pPr>
             <w:r>
               <w:rPr>
@@ -5743,7 +5743,7 @@
           </w:tcPr>
           <w:p>
             <w:pPr>
-              <w:spacing w:line="264"/>
+              <w:spacing w:line="264" w:lineRule="auto"/>
             </w:pPr>
             <w:r>
               <w:rPr>
@@ -5768,7 +5768,7 @@
           </w:tcPr>
           <w:p>
             <w:pPr>
-              <w:spacing w:line="264"/>
+              <w:spacing w:line="264" w:lineRule="auto"/>
             </w:pPr>
             <w:r>
               <w:rPr>
@@ -5795,7 +5795,7 @@
           </w:tcPr>
           <w:p>
             <w:pPr>
-              <w:spacing w:line="264"/>
+              <w:spacing w:line="264" w:lineRule="auto"/>
             </w:pPr>
             <w:r>
               <w:rPr>
@@ -5820,7 +5820,7 @@
           </w:tcPr>
           <w:p>
             <w:pPr>
-              <w:spacing w:line="264"/>
+              <w:spacing w:line="264" w:lineRule="auto"/>
             </w:pPr>
             <w:r>
               <w:rPr>
@@ -5867,7 +5867,7 @@
           </w:tcPr>
           <w:p>
             <w:pPr>
-              <w:spacing w:line="264"/>
+              <w:spacing w:line="264" w:lineRule="auto"/>
             </w:pPr>
             <w:r>
               <w:rPr>
@@ -5892,7 +5892,7 @@
           </w:tcPr>
           <w:p>
             <w:pPr>
-              <w:spacing w:line="264"/>
+              <w:spacing w:line="264" w:lineRule="auto"/>
             </w:pPr>
             <w:r>
               <w:rPr>
@@ -5939,7 +5939,7 @@
           <w:ilvl w:val="0"/>
           <w:numId w:val="12"/>
         </w:numPr>
-        <w:spacing w:after="110" w:line="276"/>
+        <w:spacing w:after="110" w:line="276" w:lineRule="auto"/>
       </w:pPr>
       <w:r>
         <w:rPr>
@@ -5969,7 +5969,7 @@
           <w:ilvl w:val="0"/>
           <w:numId w:val="12"/>
         </w:numPr>
-        <w:spacing w:after="110" w:line="276"/>
+        <w:spacing w:after="110" w:line="276" w:lineRule="auto"/>
       </w:pPr>
       <w:r>
         <w:rPr>
@@ -5999,7 +5999,7 @@
           <w:ilvl w:val="0"/>
           <w:numId w:val="12"/>
         </w:numPr>
-        <w:spacing w:after="110" w:line="276"/>
+        <w:spacing w:after="110" w:line="276" w:lineRule="auto"/>
       </w:pPr>
       <w:r>
         <w:rPr>
@@ -6029,7 +6029,7 @@
           <w:ilvl w:val="0"/>
           <w:numId w:val="12"/>
         </w:numPr>
-        <w:spacing w:after="110" w:line="276"/>
+        <w:spacing w:after="110" w:line="276" w:lineRule="auto"/>
       </w:pPr>
       <w:r>
         <w:rPr>
@@ -6068,7 +6068,7 @@
     </w:p>
     <w:p>
       <w:pPr>
-        <w:spacing w:after="140" w:line="276"/>
+        <w:spacing w:after="140" w:line="276" w:lineRule="auto"/>
       </w:pPr>
       <w:r>
         <w:rPr>
@@ -6414,7 +6414,7 @@
     </w:rPrDefault>
     <w:pPrDefault>
       <w:pPr>
-        <w:spacing w:line="276"/>
+        <w:spacing w:line="276" w:lineRule="auto"/>
       </w:pPr>
     </w:pPrDefault>
   </w:docDefaults>

</xml_diff>

<commit_message>
Document the two rule changes in the page and both guides
The suppression note still read as though every empty move to a berth is
dropped, and nothing described the new order-pin note at all. Say in all
three places that a move out of the section prints, and what the pin note
means when a reader hits one.
</commit_message>
<xml_diff>
--- a/HOW TO USE.docx
+++ b/HOW TO USE.docx
@@ -4811,7 +4811,57 @@
           <w:sz w:val="21"/>
           <w:szCs w:val="21"/>
         </w:rPr>
-        <w:t xml:space="preserve">, each with its diagram number, so you can confirm it should be off.</w:t>
+        <w:t xml:space="preserve">, each with its diagram number, so you can confirm it should be off. Only moves that stay inside the section are dropped — an empty run that takes a unit to another depot for the night is printed, because the section it leaves has to show it going.</w:t>
+      </w:r>
+    </w:p>
+    <w:p>
+      <w:pPr>
+        <w:pStyle w:val="ListParagraph"/>
+        <w:numPr>
+          <w:ilvl w:val="0"/>
+          <w:numId w:val="10"/>
+        </w:numPr>
+        <w:spacing w:after="110" w:line="276" w:lineRule="auto"/>
+      </w:pPr>
+      <w:r>
+        <w:rPr>
+          <w:rFonts w:ascii="Calibri" w:cs="Calibri" w:eastAsia="Calibri" w:hAnsi="Calibri"/>
+          <w:b/>
+          <w:bCs/>
+          <w:color w:val="262E33"/>
+          <w:sz w:val="21"/>
+          <w:szCs w:val="21"/>
+        </w:rPr>
+        <w:t xml:space="preserve">A unit order pinned somewhere but not here.</w:t>
+      </w:r>
+      <w:r>
+        <w:rPr>
+          <w:rFonts w:ascii="Calibri" w:cs="Calibri" w:eastAsia="Calibri" w:hAnsi="Calibri"/>
+          <w:color w:val="262E33"/>
+          <w:sz w:val="21"/>
+          <w:szCs w:val="21"/>
+        </w:rPr>
+        <w:t xml:space="preserve"> Where a formation's order has been written down for one departure and this one is not covered, it says so and tells you where the order </w:t>
+      </w:r>
+      <w:r>
+        <w:rPr>
+          <w:rFonts w:ascii="Calibri" w:cs="Calibri" w:eastAsia="Calibri" w:hAnsi="Calibri"/>
+          <w:i/>
+          <w:iCs/>
+          <w:color w:val="262E33"/>
+          <w:sz w:val="21"/>
+          <w:szCs w:val="21"/>
+        </w:rPr>
+        <w:t xml:space="preserve">is</w:t>
+      </w:r>
+      <w:r>
+        <w:rPr>
+          <w:rFonts w:ascii="Calibri" w:cs="Calibri" w:eastAsia="Calibri" w:hAnsi="Calibri"/>
+          <w:color w:val="262E33"/>
+          <w:sz w:val="21"/>
+          <w:szCs w:val="21"/>
+        </w:rPr>
+        <w:t xml:space="preserve"> recorded. Usually it means either this one needs pinning too, or the working has moved and the existing pin no longer reaches it.</w:t>
       </w:r>
     </w:p>
     <w:p>

</xml_diff>

<commit_message>
Rebuild the Word guide, which was a day behind the tool
HOW TO USE.docx was last generated at 02:15 this morning. Everything
since then - SPLITS PM read from the berthing, double lines at three
hours, the attachment rule, the weekend books following the weekday
rulebook, and today's copy fixes - was written into HOW TO USE.md and
into the generator, and never built.

So the file people are actually sent still said the line was drawn at
midday and 20:00, and that the headcode box sits above each drop zone.

Nothing catches this. The docx is a committed artifact with no build
step that produces it and no test that compares it, which makes it the
same shape of problem as the page copy that still claimed "rear-first" -
a second copy of something, kept by hand, with nothing to say when it
has drifted.

Co-Authored-By: Claude Opus 5 <noreply@anthropic.com>
Claude-Session: https://claude.ai/code/session_01Bo8y3CPA6i1JGS4N3h4DXr
</commit_message>
<xml_diff>
--- a/HOW TO USE.docx
+++ b/HOW TO USE.docx
@@ -4527,7 +4527,7 @@
                 <w:sz w:val="21"/>
                 <w:szCs w:val="21"/>
               </w:rPr>
-              <w:t xml:space="preserve">Empty moves into a berth with no passenger work afterwards aren't listed — the same as the hand-built sheets. Every one of them is named on the review list, so nothing disappears quietly.</w:t>
+              <w:t xml:space="preserve">Empty moves into a berth with no passenger work afterwards aren't listed — the same as the hand-built sheets. So is a unit that stands somewhere for the last time in the day and then runs empty to a depot without ever being shunted where it stood: that is a wait on the way home, and the line belongs to the depot it is going to. Every one of them is named on the review list, so nothing disappears quietly.</w:t>
             </w:r>
           </w:p>
         </w:tc>
@@ -4643,7 +4643,7 @@
           <w:sz w:val="20"/>
           <w:szCs w:val="20"/>
         </w:rPr>
-        <w:t xml:space="preserve">The double line</w:t>
+        <w:t xml:space="preserve">The double lines</w:t>
       </w:r>
     </w:p>
     <w:p>
@@ -4657,7 +4657,27 @@
           <w:sz w:val="21"/>
           <w:szCs w:val="21"/>
         </w:rPr>
-        <w:t xml:space="preserve">The double line rules off the morning: it sits under the section's last entry before midday, where the gap that follows is two hours or more. A section worked steadily through midday has no line, and Grove Park is never ruled. On the weekend sheets the line is drawn where the section crosses midday and 20:00 instead — the three goes of a shift.</w:t>
+        <w:t xml:space="preserve">Double lines rule off the breaks in the day's work. Any break of </w:t>
+      </w:r>
+      <w:r>
+        <w:rPr>
+          <w:rFonts w:ascii="Calibri" w:cs="Calibri" w:eastAsia="Calibri" w:hAnsi="Calibri"/>
+          <w:b/>
+          <w:bCs/>
+          <w:color w:val="262E33"/>
+          <w:sz w:val="21"/>
+          <w:szCs w:val="21"/>
+        </w:rPr>
+        <w:t xml:space="preserve">three hours or more</w:t>
+      </w:r>
+      <w:r>
+        <w:rPr>
+          <w:rFonts w:ascii="Calibri" w:cs="Calibri" w:eastAsia="Calibri" w:hAnsi="Calibri"/>
+          <w:color w:val="262E33"/>
+          <w:sz w:val="21"/>
+          <w:szCs w:val="21"/>
+        </w:rPr>
+        <w:t xml:space="preserve"> with work still to come after it gets one, so a page can carry two or three — Slade Green is ruled under its 06+36 and again under its 18+04. A page that is busy right through gets none, and Grove Park is never ruled. The weekend sheets follow the same rule.</w:t>
       </w:r>
     </w:p>
     <w:p>
@@ -5036,7 +5056,7 @@
           <w:sz w:val="21"/>
           <w:szCs w:val="21"/>
         </w:rPr>
-        <w:t xml:space="preserve">Above each drop zone there is a box marked </w:t>
+        <w:t xml:space="preserve">Once a panel has built something, a box marked </w:t>
       </w:r>
       <w:r>
         <w:rPr>
@@ -5056,7 +5076,7 @@
           <w:sz w:val="21"/>
           <w:szCs w:val="21"/>
         </w:rPr>
-        <w:t xml:space="preserve"> with three tick-boxes: </w:t>
+        <w:t xml:space="preserve"> appears with it, holding three tick-boxes: </w:t>
       </w:r>
       <w:r>
         <w:rPr>
@@ -5116,7 +5136,7 @@
           <w:sz w:val="21"/>
           <w:szCs w:val="21"/>
         </w:rPr>
-        <w:t xml:space="preserve">.</w:t>
+        <w:t xml:space="preserve">. It only shows up alongside books, because ticking one rebuilds them.</w:t>
       </w:r>
     </w:p>
     <w:p>
@@ -5196,7 +5216,7 @@
           <w:sz w:val="21"/>
           <w:szCs w:val="21"/>
         </w:rPr>
-        <w:t xml:space="preserve"> headcode in the notes column — empty moves and platform starters alike, the way Victoria and Grove Park have always read.</w:t>
+        <w:t xml:space="preserve"> headcode in the notes column — empty moves and platform starters alike.</w:t>
       </w:r>
     </w:p>
     <w:p>

</xml_diff>

<commit_message>
The High Speed road is named for the document it builds
HIGH SPEED ALLOCATION SHEETS, not HIGH SPEED SHEETS - the card, the guides
and the handout's road table, which had all still been calling it HS SHEETS
from before the rename. The title fits on one line down to a 360px window and
breaks at the space below that.

An empty Metro or High Speed road also said 'nothing to berth', which neither
of those documents does; they say 'nothing to sheet' now.

The saved file name is unchanged - HS_SHEETS_<tag>.xlsx.

Co-Authored-By: Claude Opus 5 <noreply@anthropic.com>
Claude-Session: https://claude.ai/code/session_01Bo8y3CPA6i1JGS4N3h4DXr
</commit_message>
<xml_diff>
--- a/HOW TO USE.docx
+++ b/HOW TO USE.docx
@@ -2268,16 +2268,36 @@
           <w:sz w:val="21"/>
           <w:szCs w:val="21"/>
         </w:rPr>
-        <w:t xml:space="preserve">“No Metro diagrams in these reports — nothing to berth”</w:t>
-      </w:r>
-      <w:r>
-        <w:rPr>
-          <w:rFonts w:ascii="Calibri" w:cs="Calibri" w:eastAsia="Calibri" w:hAnsi="Calibri"/>
-          <w:color w:val="262E33"/>
-          <w:sz w:val="21"/>
-          <w:szCs w:val="21"/>
-        </w:rPr>
-        <w:t xml:space="preserve"> — rather than handing you an empty workbook. For Metro and High Speed it also reminds you to check the Control Cycle.</w:t>
+        <w:t xml:space="preserve">“No Metro diagrams in these reports — nothing to sheet”</w:t>
+      </w:r>
+      <w:r>
+        <w:rPr>
+          <w:rFonts w:ascii="Calibri" w:cs="Calibri" w:eastAsia="Calibri" w:hAnsi="Calibri"/>
+          <w:color w:val="262E33"/>
+          <w:sz w:val="21"/>
+          <w:szCs w:val="21"/>
+        </w:rPr>
+        <w:t xml:space="preserve"> — rather than handing you an empty workbook; the berthing books say </w:t>
+      </w:r>
+      <w:r>
+        <w:rPr>
+          <w:rFonts w:ascii="Calibri" w:cs="Calibri" w:eastAsia="Calibri" w:hAnsi="Calibri"/>
+          <w:i/>
+          <w:iCs/>
+          <w:color w:val="262E33"/>
+          <w:sz w:val="21"/>
+          <w:szCs w:val="21"/>
+        </w:rPr>
+        <w:t xml:space="preserve">“nothing to berth”</w:t>
+      </w:r>
+      <w:r>
+        <w:rPr>
+          <w:rFonts w:ascii="Calibri" w:cs="Calibri" w:eastAsia="Calibri" w:hAnsi="Calibri"/>
+          <w:color w:val="262E33"/>
+          <w:sz w:val="21"/>
+          <w:szCs w:val="21"/>
+        </w:rPr>
+        <w:t xml:space="preserve">. For Metro and High Speed it also reminds you to check the Control Cycle.</w:t>
       </w:r>
     </w:p>
     <w:p>
@@ -2882,7 +2902,7 @@
                 <w:sz w:val="18"/>
                 <w:szCs w:val="18"/>
               </w:rPr>
-              <w:t xml:space="preserve">HS SHEETS</w:t>
+              <w:t xml:space="preserve">HIGH SPEED ALLOCATION SHEETS</w:t>
             </w:r>
           </w:p>
         </w:tc>
@@ -6178,7 +6198,7 @@
                 <w:sz w:val="21"/>
                 <w:szCs w:val="21"/>
               </w:rPr>
-              <w:t xml:space="preserve">A road says “nothing to berth”</w:t>
+              <w:t xml:space="preserve">A road says “nothing to berth” or “nothing to sheet”</w:t>
             </w:r>
           </w:p>
         </w:tc>

</xml_diff>